<commit_message>
About: three separate photos, new copy, and stop the card clipping its content on mobile
</commit_message>
<xml_diff>
--- a/Vrinda-Khandelwal-Product-Designer.docx
+++ b/Vrinda-Khandelwal-Product-Designer.docx
@@ -894,7 +894,7 @@
           <w:sz w:val="19"/>
           <w:szCs w:val="19"/>
         </w:rPr>
-        <w:t xml:space="preserve">User research and discovery · Talking to users · Problem framing · Research synthesis and storytelling · Journey mapping · Storyboarding · Persona development · Information architecture · Interaction design · Wireframing and prototyping · Usability studies · Accessible and inclusive design</w:t>
+        <w:t xml:space="preserve">User research and discovery · Talking to users · Problem framing · Research synthesis and storytelling · Journey mapping · Storyboarding · Persona development · Information architecture · User flow mapping · Design strategy · Interaction design · User interface design · Wireframing and prototyping · Usability testing · Accessible and inclusive design</w:t>
       </w:r>
     </w:p>
     <w:p>
@@ -944,7 +944,7 @@
           <w:sz w:val="19"/>
           <w:szCs w:val="19"/>
         </w:rPr>
-        <w:t xml:space="preserve">Lovable · Prompt engineering · AI assisted ideation, research synthesis and rapid prototyping</w:t>
+        <w:t xml:space="preserve">Lovable · Prompt engineering · AI enhanced design ideation · AI assisted research synthesis and rapid prototyping</w:t>
       </w:r>
     </w:p>
     <w:p>
@@ -994,7 +994,7 @@
           <w:sz w:val="19"/>
           <w:szCs w:val="19"/>
         </w:rPr>
-        <w:t xml:space="preserve">Empathy and user centred thinking · Cross functional collaboration across design, product and engineering · Stakeholder storytelling · Problem solving · Attention to detail · Clear communication · Adaptability</w:t>
+        <w:t xml:space="preserve">Creative · Collaborative · Critical thinking · Communication · Problem solving · Empathy and user centred thinking · Stakeholder storytelling · Attention to detail · Adaptability</w:t>
       </w:r>
     </w:p>
     <w:p>

</xml_diff>